<commit_message>
docs(report): update readme and regenerate report without embedded images
</commit_message>
<xml_diff>
--- a/Relatorio_Previsao_Nota_Final.docx
+++ b/Relatorio_Previsao_Nota_Final.docx
@@ -933,7 +933,7 @@
         <w:spacing w:after="200"/>
       </w:pPr>
       <w:r>
-        <w:t xml:space="preserve">Foram treinados e comparados dois modelos de regressão: Regressão Linear (modelo simples e interpretável, usado como baseline) e Random Forest Regressor (modelo capaz de capturar relações não lineares entre as variáveis). Os dados foram divididos em 75% para treino e 25% para teste, de forma aleatória e reprodutível (seed fixa).</w:t>
+        <w:t xml:space="preserve">Foram treinados e comparados dois modelos de regressão: Regressão Linear (modelo simples e interpretável, usado como baseline) e Random Forest Regressor (modelo capaz de capturar relações não lineares entre as variáveis). Os dados foram divididos em 75% para treino e 25% para teste, de forma aleatória e reprodutível (seed fixa). As visualizações de análise (dispersão real vs. previsto, histograma de erros e correlação entre variáveis) são impressas diretamente no terminal em formato de gráfico ASCII ao executar o script, sem gerar arquivos de imagem.</w:t>
       </w:r>
     </w:p>
     <w:p>
@@ -1025,7 +1025,21 @@
           <w:sz w:val="16"/>
           <w:szCs w:val="16"/>
         </w:rPr>
-        <w:t xml:space="preserve">Gera também os gráficos de análise em outputs/graficos/.</w:t>
+        <w:t xml:space="preserve">Os gráficos de análise são impressos diretamente no terminal (ASCII),</w:t>
+      </w:r>
+    </w:p>
+    <w:p>
+      <w:pPr>
+        <w:shd w:fill="F5F5F5" w:val="clear"/>
+        <w:spacing w:after="0"/>
+      </w:pPr>
+      <w:r>
+        <w:rPr>
+          <w:rFonts w:ascii="Consolas" w:cs="Consolas" w:eastAsia="Consolas" w:hAnsi="Consolas"/>
+          <w:sz w:val="16"/>
+          <w:szCs w:val="16"/>
+        </w:rPr>
+        <w:t xml:space="preserve">sem gerar arquivos de imagem.</w:t>
       </w:r>
     </w:p>
     <w:p>
@@ -1095,20 +1109,6 @@
           <w:sz w:val="16"/>
           <w:szCs w:val="16"/>
         </w:rPr>
-        <w:t xml:space="preserve">import matplotlib.pyplot as plt</w:t>
-      </w:r>
-    </w:p>
-    <w:p>
-      <w:pPr>
-        <w:shd w:fill="F5F5F5" w:val="clear"/>
-        <w:spacing w:after="0"/>
-      </w:pPr>
-      <w:r>
-        <w:rPr>
-          <w:rFonts w:ascii="Consolas" w:cs="Consolas" w:eastAsia="Consolas" w:hAnsi="Consolas"/>
-          <w:sz w:val="16"/>
-          <w:szCs w:val="16"/>
-        </w:rPr>
         <w:t xml:space="preserve">import numpy as np</w:t>
       </w:r>
     </w:p>
@@ -1305,20 +1305,6 @@
           <w:sz w:val="16"/>
           <w:szCs w:val="16"/>
         </w:rPr>
-        <w:t xml:space="preserve">GRAF_DIR = os.path.join(OUT_DIR, "graficos")</w:t>
-      </w:r>
-    </w:p>
-    <w:p>
-      <w:pPr>
-        <w:shd w:fill="F5F5F5" w:val="clear"/>
-        <w:spacing w:after="0"/>
-      </w:pPr>
-      <w:r>
-        <w:rPr>
-          <w:rFonts w:ascii="Consolas" w:cs="Consolas" w:eastAsia="Consolas" w:hAnsi="Consolas"/>
-          <w:sz w:val="16"/>
-          <w:szCs w:val="16"/>
-        </w:rPr>
         <w:t xml:space="preserve"> </w:t>
       </w:r>
     </w:p>
@@ -2033,6 +2019,636 @@
           <w:sz w:val="16"/>
           <w:szCs w:val="16"/>
         </w:rPr>
+        <w:t xml:space="preserve">def barra(valor, valor_max, largura=40):</w:t>
+      </w:r>
+    </w:p>
+    <w:p>
+      <w:pPr>
+        <w:shd w:fill="F5F5F5" w:val="clear"/>
+        <w:spacing w:after="0"/>
+      </w:pPr>
+      <w:r>
+        <w:rPr>
+          <w:rFonts w:ascii="Consolas" w:cs="Consolas" w:eastAsia="Consolas" w:hAnsi="Consolas"/>
+          <w:sz w:val="16"/>
+          <w:szCs w:val="16"/>
+        </w:rPr>
+        <w:t xml:space="preserve">    """Desenha uma barra ASCII proporcional a valor/valor_max."""</w:t>
+      </w:r>
+    </w:p>
+    <w:p>
+      <w:pPr>
+        <w:shd w:fill="F5F5F5" w:val="clear"/>
+        <w:spacing w:after="0"/>
+      </w:pPr>
+      <w:r>
+        <w:rPr>
+          <w:rFonts w:ascii="Consolas" w:cs="Consolas" w:eastAsia="Consolas" w:hAnsi="Consolas"/>
+          <w:sz w:val="16"/>
+          <w:szCs w:val="16"/>
+        </w:rPr>
+        <w:t xml:space="preserve">    n = int(round(largura * valor / valor_max)) if valor_max else 0</w:t>
+      </w:r>
+    </w:p>
+    <w:p>
+      <w:pPr>
+        <w:shd w:fill="F5F5F5" w:val="clear"/>
+        <w:spacing w:after="0"/>
+      </w:pPr>
+      <w:r>
+        <w:rPr>
+          <w:rFonts w:ascii="Consolas" w:cs="Consolas" w:eastAsia="Consolas" w:hAnsi="Consolas"/>
+          <w:sz w:val="16"/>
+          <w:szCs w:val="16"/>
+        </w:rPr>
+        <w:t xml:space="preserve">    n = max(0, min(largura, n))</w:t>
+      </w:r>
+    </w:p>
+    <w:p>
+      <w:pPr>
+        <w:shd w:fill="F5F5F5" w:val="clear"/>
+        <w:spacing w:after="0"/>
+      </w:pPr>
+      <w:r>
+        <w:rPr>
+          <w:rFonts w:ascii="Consolas" w:cs="Consolas" w:eastAsia="Consolas" w:hAnsi="Consolas"/>
+          <w:sz w:val="16"/>
+          <w:szCs w:val="16"/>
+        </w:rPr>
+        <w:t xml:space="preserve">    return "#" * n</w:t>
+      </w:r>
+    </w:p>
+    <w:p>
+      <w:pPr>
+        <w:shd w:fill="F5F5F5" w:val="clear"/>
+        <w:spacing w:after="0"/>
+      </w:pPr>
+      <w:r>
+        <w:rPr>
+          <w:rFonts w:ascii="Consolas" w:cs="Consolas" w:eastAsia="Consolas" w:hAnsi="Consolas"/>
+          <w:sz w:val="16"/>
+          <w:szCs w:val="16"/>
+        </w:rPr>
+        <w:t xml:space="preserve"> </w:t>
+      </w:r>
+    </w:p>
+    <w:p>
+      <w:pPr>
+        <w:shd w:fill="F5F5F5" w:val="clear"/>
+        <w:spacing w:after="0"/>
+      </w:pPr>
+      <w:r>
+        <w:rPr>
+          <w:rFonts w:ascii="Consolas" w:cs="Consolas" w:eastAsia="Consolas" w:hAnsi="Consolas"/>
+          <w:sz w:val="16"/>
+          <w:szCs w:val="16"/>
+        </w:rPr>
+        <w:t xml:space="preserve"> </w:t>
+      </w:r>
+    </w:p>
+    <w:p>
+      <w:pPr>
+        <w:shd w:fill="F5F5F5" w:val="clear"/>
+        <w:spacing w:after="0"/>
+      </w:pPr>
+      <w:r>
+        <w:rPr>
+          <w:rFonts w:ascii="Consolas" w:cs="Consolas" w:eastAsia="Consolas" w:hAnsi="Consolas"/>
+          <w:sz w:val="16"/>
+          <w:szCs w:val="16"/>
+        </w:rPr>
+        <w:t xml:space="preserve">def grafico_real_vs_previsto(y_test, y_pred):</w:t>
+      </w:r>
+    </w:p>
+    <w:p>
+      <w:pPr>
+        <w:shd w:fill="F5F5F5" w:val="clear"/>
+        <w:spacing w:after="0"/>
+      </w:pPr>
+      <w:r>
+        <w:rPr>
+          <w:rFonts w:ascii="Consolas" w:cs="Consolas" w:eastAsia="Consolas" w:hAnsi="Consolas"/>
+          <w:sz w:val="16"/>
+          <w:szCs w:val="16"/>
+        </w:rPr>
+        <w:t xml:space="preserve">    print("\n--- Nota real vs. Nota prevista (amostra de 20 alunos) ---")</w:t>
+      </w:r>
+    </w:p>
+    <w:p>
+      <w:pPr>
+        <w:shd w:fill="F5F5F5" w:val="clear"/>
+        <w:spacing w:after="0"/>
+      </w:pPr>
+      <w:r>
+        <w:rPr>
+          <w:rFonts w:ascii="Consolas" w:cs="Consolas" w:eastAsia="Consolas" w:hAnsi="Consolas"/>
+          <w:sz w:val="16"/>
+          <w:szCs w:val="16"/>
+        </w:rPr>
+        <w:t xml:space="preserve">    idx = np.linspace(0, len(y_test) - 1, min(20, len(y_test))).astype(int)</w:t>
+      </w:r>
+    </w:p>
+    <w:p>
+      <w:pPr>
+        <w:shd w:fill="F5F5F5" w:val="clear"/>
+        <w:spacing w:after="0"/>
+      </w:pPr>
+      <w:r>
+        <w:rPr>
+          <w:rFonts w:ascii="Consolas" w:cs="Consolas" w:eastAsia="Consolas" w:hAnsi="Consolas"/>
+          <w:sz w:val="16"/>
+          <w:szCs w:val="16"/>
+        </w:rPr>
+        <w:t xml:space="preserve">    y_test_arr = np.array(y_test)</w:t>
+      </w:r>
+    </w:p>
+    <w:p>
+      <w:pPr>
+        <w:shd w:fill="F5F5F5" w:val="clear"/>
+        <w:spacing w:after="0"/>
+      </w:pPr>
+      <w:r>
+        <w:rPr>
+          <w:rFonts w:ascii="Consolas" w:cs="Consolas" w:eastAsia="Consolas" w:hAnsi="Consolas"/>
+          <w:sz w:val="16"/>
+          <w:szCs w:val="16"/>
+        </w:rPr>
+        <w:t xml:space="preserve">    largura = 30</w:t>
+      </w:r>
+    </w:p>
+    <w:p>
+      <w:pPr>
+        <w:shd w:fill="F5F5F5" w:val="clear"/>
+        <w:spacing w:after="0"/>
+      </w:pPr>
+      <w:r>
+        <w:rPr>
+          <w:rFonts w:ascii="Consolas" w:cs="Consolas" w:eastAsia="Consolas" w:hAnsi="Consolas"/>
+          <w:sz w:val="16"/>
+          <w:szCs w:val="16"/>
+        </w:rPr>
+        <w:t xml:space="preserve">    for i in idx:</w:t>
+      </w:r>
+    </w:p>
+    <w:p>
+      <w:pPr>
+        <w:shd w:fill="F5F5F5" w:val="clear"/>
+        <w:spacing w:after="0"/>
+      </w:pPr>
+      <w:r>
+        <w:rPr>
+          <w:rFonts w:ascii="Consolas" w:cs="Consolas" w:eastAsia="Consolas" w:hAnsi="Consolas"/>
+          <w:sz w:val="16"/>
+          <w:szCs w:val="16"/>
+        </w:rPr>
+        <w:t xml:space="preserve">        real = y_test_arr[i]</w:t>
+      </w:r>
+    </w:p>
+    <w:p>
+      <w:pPr>
+        <w:shd w:fill="F5F5F5" w:val="clear"/>
+        <w:spacing w:after="0"/>
+      </w:pPr>
+      <w:r>
+        <w:rPr>
+          <w:rFonts w:ascii="Consolas" w:cs="Consolas" w:eastAsia="Consolas" w:hAnsi="Consolas"/>
+          <w:sz w:val="16"/>
+          <w:szCs w:val="16"/>
+        </w:rPr>
+        <w:t xml:space="preserve">        prev = y_pred[i]</w:t>
+      </w:r>
+    </w:p>
+    <w:p>
+      <w:pPr>
+        <w:shd w:fill="F5F5F5" w:val="clear"/>
+        <w:spacing w:after="0"/>
+      </w:pPr>
+      <w:r>
+        <w:rPr>
+          <w:rFonts w:ascii="Consolas" w:cs="Consolas" w:eastAsia="Consolas" w:hAnsi="Consolas"/>
+          <w:sz w:val="16"/>
+          <w:szCs w:val="16"/>
+        </w:rPr>
+        <w:t xml:space="preserve">        linha = list(" " * (largura + 1))</w:t>
+      </w:r>
+    </w:p>
+    <w:p>
+      <w:pPr>
+        <w:shd w:fill="F5F5F5" w:val="clear"/>
+        <w:spacing w:after="0"/>
+      </w:pPr>
+      <w:r>
+        <w:rPr>
+          <w:rFonts w:ascii="Consolas" w:cs="Consolas" w:eastAsia="Consolas" w:hAnsi="Consolas"/>
+          <w:sz w:val="16"/>
+          <w:szCs w:val="16"/>
+        </w:rPr>
+        <w:t xml:space="preserve">        pos_real = min(largura, max(0, round(real / 10 * largura)))</w:t>
+      </w:r>
+    </w:p>
+    <w:p>
+      <w:pPr>
+        <w:shd w:fill="F5F5F5" w:val="clear"/>
+        <w:spacing w:after="0"/>
+      </w:pPr>
+      <w:r>
+        <w:rPr>
+          <w:rFonts w:ascii="Consolas" w:cs="Consolas" w:eastAsia="Consolas" w:hAnsi="Consolas"/>
+          <w:sz w:val="16"/>
+          <w:szCs w:val="16"/>
+        </w:rPr>
+        <w:t xml:space="preserve">        pos_prev = min(largura, max(0, round(prev / 10 * largura)))</w:t>
+      </w:r>
+    </w:p>
+    <w:p>
+      <w:pPr>
+        <w:shd w:fill="F5F5F5" w:val="clear"/>
+        <w:spacing w:after="0"/>
+      </w:pPr>
+      <w:r>
+        <w:rPr>
+          <w:rFonts w:ascii="Consolas" w:cs="Consolas" w:eastAsia="Consolas" w:hAnsi="Consolas"/>
+          <w:sz w:val="16"/>
+          <w:szCs w:val="16"/>
+        </w:rPr>
+        <w:t xml:space="preserve">        linha[pos_real] = "R"</w:t>
+      </w:r>
+    </w:p>
+    <w:p>
+      <w:pPr>
+        <w:shd w:fill="F5F5F5" w:val="clear"/>
+        <w:spacing w:after="0"/>
+      </w:pPr>
+      <w:r>
+        <w:rPr>
+          <w:rFonts w:ascii="Consolas" w:cs="Consolas" w:eastAsia="Consolas" w:hAnsi="Consolas"/>
+          <w:sz w:val="16"/>
+          <w:szCs w:val="16"/>
+        </w:rPr>
+        <w:t xml:space="preserve">        linha[pos_prev] = "P" if pos_prev != pos_real else "X"</w:t>
+      </w:r>
+    </w:p>
+    <w:p>
+      <w:pPr>
+        <w:shd w:fill="F5F5F5" w:val="clear"/>
+        <w:spacing w:after="0"/>
+      </w:pPr>
+      <w:r>
+        <w:rPr>
+          <w:rFonts w:ascii="Consolas" w:cs="Consolas" w:eastAsia="Consolas" w:hAnsi="Consolas"/>
+          <w:sz w:val="16"/>
+          <w:szCs w:val="16"/>
+        </w:rPr>
+        <w:t xml:space="preserve">        print(f"{real:4.1f} |{''.join(linha)}| previsto {prev:4.1f}")</w:t>
+      </w:r>
+    </w:p>
+    <w:p>
+      <w:pPr>
+        <w:shd w:fill="F5F5F5" w:val="clear"/>
+        <w:spacing w:after="0"/>
+      </w:pPr>
+      <w:r>
+        <w:rPr>
+          <w:rFonts w:ascii="Consolas" w:cs="Consolas" w:eastAsia="Consolas" w:hAnsi="Consolas"/>
+          <w:sz w:val="16"/>
+          <w:szCs w:val="16"/>
+        </w:rPr>
+        <w:t xml:space="preserve">    print("      (R = nota real, P = nota prevista, X = coincidem)")</w:t>
+      </w:r>
+    </w:p>
+    <w:p>
+      <w:pPr>
+        <w:shd w:fill="F5F5F5" w:val="clear"/>
+        <w:spacing w:after="0"/>
+      </w:pPr>
+      <w:r>
+        <w:rPr>
+          <w:rFonts w:ascii="Consolas" w:cs="Consolas" w:eastAsia="Consolas" w:hAnsi="Consolas"/>
+          <w:sz w:val="16"/>
+          <w:szCs w:val="16"/>
+        </w:rPr>
+        <w:t xml:space="preserve"> </w:t>
+      </w:r>
+    </w:p>
+    <w:p>
+      <w:pPr>
+        <w:shd w:fill="F5F5F5" w:val="clear"/>
+        <w:spacing w:after="0"/>
+      </w:pPr>
+      <w:r>
+        <w:rPr>
+          <w:rFonts w:ascii="Consolas" w:cs="Consolas" w:eastAsia="Consolas" w:hAnsi="Consolas"/>
+          <w:sz w:val="16"/>
+          <w:szCs w:val="16"/>
+        </w:rPr>
+        <w:t xml:space="preserve"> </w:t>
+      </w:r>
+    </w:p>
+    <w:p>
+      <w:pPr>
+        <w:shd w:fill="F5F5F5" w:val="clear"/>
+        <w:spacing w:after="0"/>
+      </w:pPr>
+      <w:r>
+        <w:rPr>
+          <w:rFonts w:ascii="Consolas" w:cs="Consolas" w:eastAsia="Consolas" w:hAnsi="Consolas"/>
+          <w:sz w:val="16"/>
+          <w:szCs w:val="16"/>
+        </w:rPr>
+        <w:t xml:space="preserve">def grafico_distribuicao_erros(erros, media_erro):</w:t>
+      </w:r>
+    </w:p>
+    <w:p>
+      <w:pPr>
+        <w:shd w:fill="F5F5F5" w:val="clear"/>
+        <w:spacing w:after="0"/>
+      </w:pPr>
+      <w:r>
+        <w:rPr>
+          <w:rFonts w:ascii="Consolas" w:cs="Consolas" w:eastAsia="Consolas" w:hAnsi="Consolas"/>
+          <w:sz w:val="16"/>
+          <w:szCs w:val="16"/>
+        </w:rPr>
+        <w:t xml:space="preserve">    print("\n--- Distribuição dos erros de previsão (histograma) ---")</w:t>
+      </w:r>
+    </w:p>
+    <w:p>
+      <w:pPr>
+        <w:shd w:fill="F5F5F5" w:val="clear"/>
+        <w:spacing w:after="0"/>
+      </w:pPr>
+      <w:r>
+        <w:rPr>
+          <w:rFonts w:ascii="Consolas" w:cs="Consolas" w:eastAsia="Consolas" w:hAnsi="Consolas"/>
+          <w:sz w:val="16"/>
+          <w:szCs w:val="16"/>
+        </w:rPr>
+        <w:t xml:space="preserve">    n_bins = 10</w:t>
+      </w:r>
+    </w:p>
+    <w:p>
+      <w:pPr>
+        <w:shd w:fill="F5F5F5" w:val="clear"/>
+        <w:spacing w:after="0"/>
+      </w:pPr>
+      <w:r>
+        <w:rPr>
+          <w:rFonts w:ascii="Consolas" w:cs="Consolas" w:eastAsia="Consolas" w:hAnsi="Consolas"/>
+          <w:sz w:val="16"/>
+          <w:szCs w:val="16"/>
+        </w:rPr>
+        <w:t xml:space="preserve">    minimo, maximo = erros.min(), erros.max()</w:t>
+      </w:r>
+    </w:p>
+    <w:p>
+      <w:pPr>
+        <w:shd w:fill="F5F5F5" w:val="clear"/>
+        <w:spacing w:after="0"/>
+      </w:pPr>
+      <w:r>
+        <w:rPr>
+          <w:rFonts w:ascii="Consolas" w:cs="Consolas" w:eastAsia="Consolas" w:hAnsi="Consolas"/>
+          <w:sz w:val="16"/>
+          <w:szCs w:val="16"/>
+        </w:rPr>
+        <w:t xml:space="preserve">    bins = np.linspace(minimo, maximo, n_bins + 1)</w:t>
+      </w:r>
+    </w:p>
+    <w:p>
+      <w:pPr>
+        <w:shd w:fill="F5F5F5" w:val="clear"/>
+        <w:spacing w:after="0"/>
+      </w:pPr>
+      <w:r>
+        <w:rPr>
+          <w:rFonts w:ascii="Consolas" w:cs="Consolas" w:eastAsia="Consolas" w:hAnsi="Consolas"/>
+          <w:sz w:val="16"/>
+          <w:szCs w:val="16"/>
+        </w:rPr>
+        <w:t xml:space="preserve">    contagem, _ = np.histogram(erros, bins=bins)</w:t>
+      </w:r>
+    </w:p>
+    <w:p>
+      <w:pPr>
+        <w:shd w:fill="F5F5F5" w:val="clear"/>
+        <w:spacing w:after="0"/>
+      </w:pPr>
+      <w:r>
+        <w:rPr>
+          <w:rFonts w:ascii="Consolas" w:cs="Consolas" w:eastAsia="Consolas" w:hAnsi="Consolas"/>
+          <w:sz w:val="16"/>
+          <w:szCs w:val="16"/>
+        </w:rPr>
+        <w:t xml:space="preserve">    max_contagem = contagem.max() if contagem.max() &gt; 0 else 1</w:t>
+      </w:r>
+    </w:p>
+    <w:p>
+      <w:pPr>
+        <w:shd w:fill="F5F5F5" w:val="clear"/>
+        <w:spacing w:after="0"/>
+      </w:pPr>
+      <w:r>
+        <w:rPr>
+          <w:rFonts w:ascii="Consolas" w:cs="Consolas" w:eastAsia="Consolas" w:hAnsi="Consolas"/>
+          <w:sz w:val="16"/>
+          <w:szCs w:val="16"/>
+        </w:rPr>
+        <w:t xml:space="preserve">    for i in range(n_bins):</w:t>
+      </w:r>
+    </w:p>
+    <w:p>
+      <w:pPr>
+        <w:shd w:fill="F5F5F5" w:val="clear"/>
+        <w:spacing w:after="0"/>
+      </w:pPr>
+      <w:r>
+        <w:rPr>
+          <w:rFonts w:ascii="Consolas" w:cs="Consolas" w:eastAsia="Consolas" w:hAnsi="Consolas"/>
+          <w:sz w:val="16"/>
+          <w:szCs w:val="16"/>
+        </w:rPr>
+        <w:t xml:space="preserve">        faixa = f"[{bins[i]:5.2f}, {bins[i + 1]:5.2f})"</w:t>
+      </w:r>
+    </w:p>
+    <w:p>
+      <w:pPr>
+        <w:shd w:fill="F5F5F5" w:val="clear"/>
+        <w:spacing w:after="0"/>
+      </w:pPr>
+      <w:r>
+        <w:rPr>
+          <w:rFonts w:ascii="Consolas" w:cs="Consolas" w:eastAsia="Consolas" w:hAnsi="Consolas"/>
+          <w:sz w:val="16"/>
+          <w:szCs w:val="16"/>
+        </w:rPr>
+        <w:t xml:space="preserve">        print(f"{faixa} | {barra(contagem[i], max_contagem)} {contagem[i]}")</w:t>
+      </w:r>
+    </w:p>
+    <w:p>
+      <w:pPr>
+        <w:shd w:fill="F5F5F5" w:val="clear"/>
+        <w:spacing w:after="0"/>
+      </w:pPr>
+      <w:r>
+        <w:rPr>
+          <w:rFonts w:ascii="Consolas" w:cs="Consolas" w:eastAsia="Consolas" w:hAnsi="Consolas"/>
+          <w:sz w:val="16"/>
+          <w:szCs w:val="16"/>
+        </w:rPr>
+        <w:t xml:space="preserve">    print(f"Média do erro marcada em: {media_erro:.3f}")</w:t>
+      </w:r>
+    </w:p>
+    <w:p>
+      <w:pPr>
+        <w:shd w:fill="F5F5F5" w:val="clear"/>
+        <w:spacing w:after="0"/>
+      </w:pPr>
+      <w:r>
+        <w:rPr>
+          <w:rFonts w:ascii="Consolas" w:cs="Consolas" w:eastAsia="Consolas" w:hAnsi="Consolas"/>
+          <w:sz w:val="16"/>
+          <w:szCs w:val="16"/>
+        </w:rPr>
+        <w:t xml:space="preserve"> </w:t>
+      </w:r>
+    </w:p>
+    <w:p>
+      <w:pPr>
+        <w:shd w:fill="F5F5F5" w:val="clear"/>
+        <w:spacing w:after="0"/>
+      </w:pPr>
+      <w:r>
+        <w:rPr>
+          <w:rFonts w:ascii="Consolas" w:cs="Consolas" w:eastAsia="Consolas" w:hAnsi="Consolas"/>
+          <w:sz w:val="16"/>
+          <w:szCs w:val="16"/>
+        </w:rPr>
+        <w:t xml:space="preserve"> </w:t>
+      </w:r>
+    </w:p>
+    <w:p>
+      <w:pPr>
+        <w:shd w:fill="F5F5F5" w:val="clear"/>
+        <w:spacing w:after="0"/>
+      </w:pPr>
+      <w:r>
+        <w:rPr>
+          <w:rFonts w:ascii="Consolas" w:cs="Consolas" w:eastAsia="Consolas" w:hAnsi="Consolas"/>
+          <w:sz w:val="16"/>
+          <w:szCs w:val="16"/>
+        </w:rPr>
+        <w:t xml:space="preserve">def grafico_correlacao(df):</w:t>
+      </w:r>
+    </w:p>
+    <w:p>
+      <w:pPr>
+        <w:shd w:fill="F5F5F5" w:val="clear"/>
+        <w:spacing w:after="0"/>
+      </w:pPr>
+      <w:r>
+        <w:rPr>
+          <w:rFonts w:ascii="Consolas" w:cs="Consolas" w:eastAsia="Consolas" w:hAnsi="Consolas"/>
+          <w:sz w:val="16"/>
+          <w:szCs w:val="16"/>
+        </w:rPr>
+        <w:t xml:space="preserve">    print("\n--- Correlação de cada variável com a nota final ---")</w:t>
+      </w:r>
+    </w:p>
+    <w:p>
+      <w:pPr>
+        <w:shd w:fill="F5F5F5" w:val="clear"/>
+        <w:spacing w:after="0"/>
+      </w:pPr>
+      <w:r>
+        <w:rPr>
+          <w:rFonts w:ascii="Consolas" w:cs="Consolas" w:eastAsia="Consolas" w:hAnsi="Consolas"/>
+          <w:sz w:val="16"/>
+          <w:szCs w:val="16"/>
+        </w:rPr>
+        <w:t xml:space="preserve">    corr = df[FEATURES + [TARGET]].corr()[TARGET].drop(TARGET)</w:t>
+      </w:r>
+    </w:p>
+    <w:p>
+      <w:pPr>
+        <w:shd w:fill="F5F5F5" w:val="clear"/>
+        <w:spacing w:after="0"/>
+      </w:pPr>
+      <w:r>
+        <w:rPr>
+          <w:rFonts w:ascii="Consolas" w:cs="Consolas" w:eastAsia="Consolas" w:hAnsi="Consolas"/>
+          <w:sz w:val="16"/>
+          <w:szCs w:val="16"/>
+        </w:rPr>
+        <w:t xml:space="preserve">    for variavel, valor in corr.items():</w:t>
+      </w:r>
+    </w:p>
+    <w:p>
+      <w:pPr>
+        <w:shd w:fill="F5F5F5" w:val="clear"/>
+        <w:spacing w:after="0"/>
+      </w:pPr>
+      <w:r>
+        <w:rPr>
+          <w:rFonts w:ascii="Consolas" w:cs="Consolas" w:eastAsia="Consolas" w:hAnsi="Consolas"/>
+          <w:sz w:val="16"/>
+          <w:szCs w:val="16"/>
+        </w:rPr>
+        <w:t xml:space="preserve">        sinal = "+" if valor &gt;= 0 else "-"</w:t>
+      </w:r>
+    </w:p>
+    <w:p>
+      <w:pPr>
+        <w:shd w:fill="F5F5F5" w:val="clear"/>
+        <w:spacing w:after="0"/>
+      </w:pPr>
+      <w:r>
+        <w:rPr>
+          <w:rFonts w:ascii="Consolas" w:cs="Consolas" w:eastAsia="Consolas" w:hAnsi="Consolas"/>
+          <w:sz w:val="16"/>
+          <w:szCs w:val="16"/>
+        </w:rPr>
+        <w:t xml:space="preserve">        print(f"{variavel:22s} {sinal}{abs(valor):.2f} {barra(abs(valor), 1.0, 30)}")</w:t>
+      </w:r>
+    </w:p>
+    <w:p>
+      <w:pPr>
+        <w:shd w:fill="F5F5F5" w:val="clear"/>
+        <w:spacing w:after="0"/>
+      </w:pPr>
+      <w:r>
+        <w:rPr>
+          <w:rFonts w:ascii="Consolas" w:cs="Consolas" w:eastAsia="Consolas" w:hAnsi="Consolas"/>
+          <w:sz w:val="16"/>
+          <w:szCs w:val="16"/>
+        </w:rPr>
+        <w:t xml:space="preserve"> </w:t>
+      </w:r>
+    </w:p>
+    <w:p>
+      <w:pPr>
+        <w:shd w:fill="F5F5F5" w:val="clear"/>
+        <w:spacing w:after="0"/>
+      </w:pPr>
+      <w:r>
+        <w:rPr>
+          <w:rFonts w:ascii="Consolas" w:cs="Consolas" w:eastAsia="Consolas" w:hAnsi="Consolas"/>
+          <w:sz w:val="16"/>
+          <w:szCs w:val="16"/>
+        </w:rPr>
+        <w:t xml:space="preserve"> </w:t>
+      </w:r>
+    </w:p>
+    <w:p>
+      <w:pPr>
+        <w:shd w:fill="F5F5F5" w:val="clear"/>
+        <w:spacing w:after="0"/>
+      </w:pPr>
+      <w:r>
+        <w:rPr>
+          <w:rFonts w:ascii="Consolas" w:cs="Consolas" w:eastAsia="Consolas" w:hAnsi="Consolas"/>
+          <w:sz w:val="16"/>
+          <w:szCs w:val="16"/>
+        </w:rPr>
         <w:t xml:space="preserve">def gerar_graficos(df, y_test, resultado):</w:t>
       </w:r>
     </w:p>
@@ -2047,777 +2663,35 @@
           <w:sz w:val="16"/>
           <w:szCs w:val="16"/>
         </w:rPr>
-        <w:t xml:space="preserve">    os.makedirs(GRAF_DIR, exist_ok=True)</w:t>
-      </w:r>
-    </w:p>
-    <w:p>
-      <w:pPr>
-        <w:shd w:fill="F5F5F5" w:val="clear"/>
-        <w:spacing w:after="0"/>
-      </w:pPr>
-      <w:r>
-        <w:rPr>
-          <w:rFonts w:ascii="Consolas" w:cs="Consolas" w:eastAsia="Consolas" w:hAnsi="Consolas"/>
-          <w:sz w:val="16"/>
-          <w:szCs w:val="16"/>
-        </w:rPr>
-        <w:t xml:space="preserve">    y_pred = resultado["y_pred"]</w:t>
-      </w:r>
-    </w:p>
-    <w:p>
-      <w:pPr>
-        <w:shd w:fill="F5F5F5" w:val="clear"/>
-        <w:spacing w:after="0"/>
-      </w:pPr>
-      <w:r>
-        <w:rPr>
-          <w:rFonts w:ascii="Consolas" w:cs="Consolas" w:eastAsia="Consolas" w:hAnsi="Consolas"/>
-          <w:sz w:val="16"/>
-          <w:szCs w:val="16"/>
-        </w:rPr>
-        <w:t xml:space="preserve">    erros = resultado["erros"]</w:t>
-      </w:r>
-    </w:p>
-    <w:p>
-      <w:pPr>
-        <w:shd w:fill="F5F5F5" w:val="clear"/>
-        <w:spacing w:after="0"/>
-      </w:pPr>
-      <w:r>
-        <w:rPr>
-          <w:rFonts w:ascii="Consolas" w:cs="Consolas" w:eastAsia="Consolas" w:hAnsi="Consolas"/>
-          <w:sz w:val="16"/>
-          <w:szCs w:val="16"/>
-        </w:rPr>
-        <w:t xml:space="preserve"> </w:t>
-      </w:r>
-    </w:p>
-    <w:p>
-      <w:pPr>
-        <w:shd w:fill="F5F5F5" w:val="clear"/>
-        <w:spacing w:after="0"/>
-      </w:pPr>
-      <w:r>
-        <w:rPr>
-          <w:rFonts w:ascii="Consolas" w:cs="Consolas" w:eastAsia="Consolas" w:hAnsi="Consolas"/>
-          <w:sz w:val="16"/>
-          <w:szCs w:val="16"/>
-        </w:rPr>
-        <w:t xml:space="preserve">    # 1) Dispersão: nota real vs. nota prevista</w:t>
-      </w:r>
-    </w:p>
-    <w:p>
-      <w:pPr>
-        <w:shd w:fill="F5F5F5" w:val="clear"/>
-        <w:spacing w:after="0"/>
-      </w:pPr>
-      <w:r>
-        <w:rPr>
-          <w:rFonts w:ascii="Consolas" w:cs="Consolas" w:eastAsia="Consolas" w:hAnsi="Consolas"/>
-          <w:sz w:val="16"/>
-          <w:szCs w:val="16"/>
-        </w:rPr>
-        <w:t xml:space="preserve">    plt.figure(figsize=(6, 6))</w:t>
-      </w:r>
-    </w:p>
-    <w:p>
-      <w:pPr>
-        <w:shd w:fill="F5F5F5" w:val="clear"/>
-        <w:spacing w:after="0"/>
-      </w:pPr>
-      <w:r>
-        <w:rPr>
-          <w:rFonts w:ascii="Consolas" w:cs="Consolas" w:eastAsia="Consolas" w:hAnsi="Consolas"/>
-          <w:sz w:val="16"/>
-          <w:szCs w:val="16"/>
-        </w:rPr>
-        <w:t xml:space="preserve">    plt.scatter(y_test, y_pred, alpha=0.6, color="#2563eb", edgecolor="white")</w:t>
-      </w:r>
-    </w:p>
-    <w:p>
-      <w:pPr>
-        <w:shd w:fill="F5F5F5" w:val="clear"/>
-        <w:spacing w:after="0"/>
-      </w:pPr>
-      <w:r>
-        <w:rPr>
-          <w:rFonts w:ascii="Consolas" w:cs="Consolas" w:eastAsia="Consolas" w:hAnsi="Consolas"/>
-          <w:sz w:val="16"/>
-          <w:szCs w:val="16"/>
-        </w:rPr>
-        <w:t xml:space="preserve">    lim = [0, 10]</w:t>
-      </w:r>
-    </w:p>
-    <w:p>
-      <w:pPr>
-        <w:shd w:fill="F5F5F5" w:val="clear"/>
-        <w:spacing w:after="0"/>
-      </w:pPr>
-      <w:r>
-        <w:rPr>
-          <w:rFonts w:ascii="Consolas" w:cs="Consolas" w:eastAsia="Consolas" w:hAnsi="Consolas"/>
-          <w:sz w:val="16"/>
-          <w:szCs w:val="16"/>
-        </w:rPr>
-        <w:t xml:space="preserve">    plt.plot(lim, lim, "--", color="gray", label="Previsão perfeita")</w:t>
-      </w:r>
-    </w:p>
-    <w:p>
-      <w:pPr>
-        <w:shd w:fill="F5F5F5" w:val="clear"/>
-        <w:spacing w:after="0"/>
-      </w:pPr>
-      <w:r>
-        <w:rPr>
-          <w:rFonts w:ascii="Consolas" w:cs="Consolas" w:eastAsia="Consolas" w:hAnsi="Consolas"/>
-          <w:sz w:val="16"/>
-          <w:szCs w:val="16"/>
-        </w:rPr>
-        <w:t xml:space="preserve">    plt.xlabel("Nota final real")</w:t>
-      </w:r>
-    </w:p>
-    <w:p>
-      <w:pPr>
-        <w:shd w:fill="F5F5F5" w:val="clear"/>
-        <w:spacing w:after="0"/>
-      </w:pPr>
-      <w:r>
-        <w:rPr>
-          <w:rFonts w:ascii="Consolas" w:cs="Consolas" w:eastAsia="Consolas" w:hAnsi="Consolas"/>
-          <w:sz w:val="16"/>
-          <w:szCs w:val="16"/>
-        </w:rPr>
-        <w:t xml:space="preserve">    plt.ylabel("Nota final prevista")</w:t>
-      </w:r>
-    </w:p>
-    <w:p>
-      <w:pPr>
-        <w:shd w:fill="F5F5F5" w:val="clear"/>
-        <w:spacing w:after="0"/>
-      </w:pPr>
-      <w:r>
-        <w:rPr>
-          <w:rFonts w:ascii="Consolas" w:cs="Consolas" w:eastAsia="Consolas" w:hAnsi="Consolas"/>
-          <w:sz w:val="16"/>
-          <w:szCs w:val="16"/>
-        </w:rPr>
-        <w:t xml:space="preserve">    plt.title("Nota real vs. Nota prevista")</w:t>
-      </w:r>
-    </w:p>
-    <w:p>
-      <w:pPr>
-        <w:shd w:fill="F5F5F5" w:val="clear"/>
-        <w:spacing w:after="0"/>
-      </w:pPr>
-      <w:r>
-        <w:rPr>
-          <w:rFonts w:ascii="Consolas" w:cs="Consolas" w:eastAsia="Consolas" w:hAnsi="Consolas"/>
-          <w:sz w:val="16"/>
-          <w:szCs w:val="16"/>
-        </w:rPr>
-        <w:t xml:space="preserve">    plt.legend()</w:t>
-      </w:r>
-    </w:p>
-    <w:p>
-      <w:pPr>
-        <w:shd w:fill="F5F5F5" w:val="clear"/>
-        <w:spacing w:after="0"/>
-      </w:pPr>
-      <w:r>
-        <w:rPr>
-          <w:rFonts w:ascii="Consolas" w:cs="Consolas" w:eastAsia="Consolas" w:hAnsi="Consolas"/>
-          <w:sz w:val="16"/>
-          <w:szCs w:val="16"/>
-        </w:rPr>
-        <w:t xml:space="preserve">    plt.tight_layout()</w:t>
-      </w:r>
-    </w:p>
-    <w:p>
-      <w:pPr>
-        <w:shd w:fill="F5F5F5" w:val="clear"/>
-        <w:spacing w:after="0"/>
-      </w:pPr>
-      <w:r>
-        <w:rPr>
-          <w:rFonts w:ascii="Consolas" w:cs="Consolas" w:eastAsia="Consolas" w:hAnsi="Consolas"/>
-          <w:sz w:val="16"/>
-          <w:szCs w:val="16"/>
-        </w:rPr>
-        <w:t xml:space="preserve">    plt.savefig(os.path.join(GRAF_DIR, "real_vs_previsto.png"), dpi=150)</w:t>
-      </w:r>
-    </w:p>
-    <w:p>
-      <w:pPr>
-        <w:shd w:fill="F5F5F5" w:val="clear"/>
-        <w:spacing w:after="0"/>
-      </w:pPr>
-      <w:r>
-        <w:rPr>
-          <w:rFonts w:ascii="Consolas" w:cs="Consolas" w:eastAsia="Consolas" w:hAnsi="Consolas"/>
-          <w:sz w:val="16"/>
-          <w:szCs w:val="16"/>
-        </w:rPr>
-        <w:t xml:space="preserve">    plt.close()</w:t>
-      </w:r>
-    </w:p>
-    <w:p>
-      <w:pPr>
-        <w:shd w:fill="F5F5F5" w:val="clear"/>
-        <w:spacing w:after="0"/>
-      </w:pPr>
-      <w:r>
-        <w:rPr>
-          <w:rFonts w:ascii="Consolas" w:cs="Consolas" w:eastAsia="Consolas" w:hAnsi="Consolas"/>
-          <w:sz w:val="16"/>
-          <w:szCs w:val="16"/>
-        </w:rPr>
-        <w:t xml:space="preserve"> </w:t>
-      </w:r>
-    </w:p>
-    <w:p>
-      <w:pPr>
-        <w:shd w:fill="F5F5F5" w:val="clear"/>
-        <w:spacing w:after="0"/>
-      </w:pPr>
-      <w:r>
-        <w:rPr>
-          <w:rFonts w:ascii="Consolas" w:cs="Consolas" w:eastAsia="Consolas" w:hAnsi="Consolas"/>
-          <w:sz w:val="16"/>
-          <w:szCs w:val="16"/>
-        </w:rPr>
-        <w:t xml:space="preserve">    # 2) Histograma dos erros de previsão</w:t>
-      </w:r>
-    </w:p>
-    <w:p>
-      <w:pPr>
-        <w:shd w:fill="F5F5F5" w:val="clear"/>
-        <w:spacing w:after="0"/>
-      </w:pPr>
-      <w:r>
-        <w:rPr>
-          <w:rFonts w:ascii="Consolas" w:cs="Consolas" w:eastAsia="Consolas" w:hAnsi="Consolas"/>
-          <w:sz w:val="16"/>
-          <w:szCs w:val="16"/>
-        </w:rPr>
-        <w:t xml:space="preserve">    plt.figure(figsize=(6, 4))</w:t>
-      </w:r>
-    </w:p>
-    <w:p>
-      <w:pPr>
-        <w:shd w:fill="F5F5F5" w:val="clear"/>
-        <w:spacing w:after="0"/>
-      </w:pPr>
-      <w:r>
-        <w:rPr>
-          <w:rFonts w:ascii="Consolas" w:cs="Consolas" w:eastAsia="Consolas" w:hAnsi="Consolas"/>
-          <w:sz w:val="16"/>
-          <w:szCs w:val="16"/>
-        </w:rPr>
-        <w:t xml:space="preserve">    plt.hist(erros, bins=20, color="#2563eb", edgecolor="white")</w:t>
-      </w:r>
-    </w:p>
-    <w:p>
-      <w:pPr>
-        <w:shd w:fill="F5F5F5" w:val="clear"/>
-        <w:spacing w:after="0"/>
-      </w:pPr>
-      <w:r>
-        <w:rPr>
-          <w:rFonts w:ascii="Consolas" w:cs="Consolas" w:eastAsia="Consolas" w:hAnsi="Consolas"/>
-          <w:sz w:val="16"/>
-          <w:szCs w:val="16"/>
-        </w:rPr>
-        <w:t xml:space="preserve">    plt.axvline(resultado["media_erro"], color="red", linestyle="--", label="Média do erro")</w:t>
-      </w:r>
-    </w:p>
-    <w:p>
-      <w:pPr>
-        <w:shd w:fill="F5F5F5" w:val="clear"/>
-        <w:spacing w:after="0"/>
-      </w:pPr>
-      <w:r>
-        <w:rPr>
-          <w:rFonts w:ascii="Consolas" w:cs="Consolas" w:eastAsia="Consolas" w:hAnsi="Consolas"/>
-          <w:sz w:val="16"/>
-          <w:szCs w:val="16"/>
-        </w:rPr>
-        <w:t xml:space="preserve">    plt.xlabel("Erro (real - previsto)")</w:t>
-      </w:r>
-    </w:p>
-    <w:p>
-      <w:pPr>
-        <w:shd w:fill="F5F5F5" w:val="clear"/>
-        <w:spacing w:after="0"/>
-      </w:pPr>
-      <w:r>
-        <w:rPr>
-          <w:rFonts w:ascii="Consolas" w:cs="Consolas" w:eastAsia="Consolas" w:hAnsi="Consolas"/>
-          <w:sz w:val="16"/>
-          <w:szCs w:val="16"/>
-        </w:rPr>
-        <w:t xml:space="preserve">    plt.ylabel("Frequência")</w:t>
-      </w:r>
-    </w:p>
-    <w:p>
-      <w:pPr>
-        <w:shd w:fill="F5F5F5" w:val="clear"/>
-        <w:spacing w:after="0"/>
-      </w:pPr>
-      <w:r>
-        <w:rPr>
-          <w:rFonts w:ascii="Consolas" w:cs="Consolas" w:eastAsia="Consolas" w:hAnsi="Consolas"/>
-          <w:sz w:val="16"/>
-          <w:szCs w:val="16"/>
-        </w:rPr>
-        <w:t xml:space="preserve">    plt.title("Distribuição dos erros de previsão")</w:t>
-      </w:r>
-    </w:p>
-    <w:p>
-      <w:pPr>
-        <w:shd w:fill="F5F5F5" w:val="clear"/>
-        <w:spacing w:after="0"/>
-      </w:pPr>
-      <w:r>
-        <w:rPr>
-          <w:rFonts w:ascii="Consolas" w:cs="Consolas" w:eastAsia="Consolas" w:hAnsi="Consolas"/>
-          <w:sz w:val="16"/>
-          <w:szCs w:val="16"/>
-        </w:rPr>
-        <w:t xml:space="preserve">    plt.legend()</w:t>
-      </w:r>
-    </w:p>
-    <w:p>
-      <w:pPr>
-        <w:shd w:fill="F5F5F5" w:val="clear"/>
-        <w:spacing w:after="0"/>
-      </w:pPr>
-      <w:r>
-        <w:rPr>
-          <w:rFonts w:ascii="Consolas" w:cs="Consolas" w:eastAsia="Consolas" w:hAnsi="Consolas"/>
-          <w:sz w:val="16"/>
-          <w:szCs w:val="16"/>
-        </w:rPr>
-        <w:t xml:space="preserve">    plt.tight_layout()</w:t>
-      </w:r>
-    </w:p>
-    <w:p>
-      <w:pPr>
-        <w:shd w:fill="F5F5F5" w:val="clear"/>
-        <w:spacing w:after="0"/>
-      </w:pPr>
-      <w:r>
-        <w:rPr>
-          <w:rFonts w:ascii="Consolas" w:cs="Consolas" w:eastAsia="Consolas" w:hAnsi="Consolas"/>
-          <w:sz w:val="16"/>
-          <w:szCs w:val="16"/>
-        </w:rPr>
-        <w:t xml:space="preserve">    plt.savefig(os.path.join(GRAF_DIR, "distribuicao_erros.png"), dpi=150)</w:t>
-      </w:r>
-    </w:p>
-    <w:p>
-      <w:pPr>
-        <w:shd w:fill="F5F5F5" w:val="clear"/>
-        <w:spacing w:after="0"/>
-      </w:pPr>
-      <w:r>
-        <w:rPr>
-          <w:rFonts w:ascii="Consolas" w:cs="Consolas" w:eastAsia="Consolas" w:hAnsi="Consolas"/>
-          <w:sz w:val="16"/>
-          <w:szCs w:val="16"/>
-        </w:rPr>
-        <w:t xml:space="preserve">    plt.close()</w:t>
-      </w:r>
-    </w:p>
-    <w:p>
-      <w:pPr>
-        <w:shd w:fill="F5F5F5" w:val="clear"/>
-        <w:spacing w:after="0"/>
-      </w:pPr>
-      <w:r>
-        <w:rPr>
-          <w:rFonts w:ascii="Consolas" w:cs="Consolas" w:eastAsia="Consolas" w:hAnsi="Consolas"/>
-          <w:sz w:val="16"/>
-          <w:szCs w:val="16"/>
-        </w:rPr>
-        <w:t xml:space="preserve"> </w:t>
-      </w:r>
-    </w:p>
-    <w:p>
-      <w:pPr>
-        <w:shd w:fill="F5F5F5" w:val="clear"/>
-        <w:spacing w:after="0"/>
-      </w:pPr>
-      <w:r>
-        <w:rPr>
-          <w:rFonts w:ascii="Consolas" w:cs="Consolas" w:eastAsia="Consolas" w:hAnsi="Consolas"/>
-          <w:sz w:val="16"/>
-          <w:szCs w:val="16"/>
-        </w:rPr>
-        <w:t xml:space="preserve">    # 3) Importância das variáveis (Random Forest)</w:t>
-      </w:r>
-    </w:p>
-    <w:p>
-      <w:pPr>
-        <w:shd w:fill="F5F5F5" w:val="clear"/>
-        <w:spacing w:after="0"/>
-      </w:pPr>
-      <w:r>
-        <w:rPr>
-          <w:rFonts w:ascii="Consolas" w:cs="Consolas" w:eastAsia="Consolas" w:hAnsi="Consolas"/>
-          <w:sz w:val="16"/>
-          <w:szCs w:val="16"/>
-        </w:rPr>
-        <w:t xml:space="preserve">    if hasattr(resultado.get("modelo"), "feature_importances_"):</w:t>
-      </w:r>
-    </w:p>
-    <w:p>
-      <w:pPr>
-        <w:shd w:fill="F5F5F5" w:val="clear"/>
-        <w:spacing w:after="0"/>
-      </w:pPr>
-      <w:r>
-        <w:rPr>
-          <w:rFonts w:ascii="Consolas" w:cs="Consolas" w:eastAsia="Consolas" w:hAnsi="Consolas"/>
-          <w:sz w:val="16"/>
-          <w:szCs w:val="16"/>
-        </w:rPr>
-        <w:t xml:space="preserve">        importancias = resultado["modelo"].feature_importances_</w:t>
-      </w:r>
-    </w:p>
-    <w:p>
-      <w:pPr>
-        <w:shd w:fill="F5F5F5" w:val="clear"/>
-        <w:spacing w:after="0"/>
-      </w:pPr>
-      <w:r>
-        <w:rPr>
-          <w:rFonts w:ascii="Consolas" w:cs="Consolas" w:eastAsia="Consolas" w:hAnsi="Consolas"/>
-          <w:sz w:val="16"/>
-          <w:szCs w:val="16"/>
-        </w:rPr>
-        <w:t xml:space="preserve">        plt.figure(figsize=(6, 4))</w:t>
-      </w:r>
-    </w:p>
-    <w:p>
-      <w:pPr>
-        <w:shd w:fill="F5F5F5" w:val="clear"/>
-        <w:spacing w:after="0"/>
-      </w:pPr>
-      <w:r>
-        <w:rPr>
-          <w:rFonts w:ascii="Consolas" w:cs="Consolas" w:eastAsia="Consolas" w:hAnsi="Consolas"/>
-          <w:sz w:val="16"/>
-          <w:szCs w:val="16"/>
-        </w:rPr>
-        <w:t xml:space="preserve">        plt.barh(FEATURES, importancias, color="#2563eb")</w:t>
-      </w:r>
-    </w:p>
-    <w:p>
-      <w:pPr>
-        <w:shd w:fill="F5F5F5" w:val="clear"/>
-        <w:spacing w:after="0"/>
-      </w:pPr>
-      <w:r>
-        <w:rPr>
-          <w:rFonts w:ascii="Consolas" w:cs="Consolas" w:eastAsia="Consolas" w:hAnsi="Consolas"/>
-          <w:sz w:val="16"/>
-          <w:szCs w:val="16"/>
-        </w:rPr>
-        <w:t xml:space="preserve">        plt.xlabel("Importância relativa")</w:t>
-      </w:r>
-    </w:p>
-    <w:p>
-      <w:pPr>
-        <w:shd w:fill="F5F5F5" w:val="clear"/>
-        <w:spacing w:after="0"/>
-      </w:pPr>
-      <w:r>
-        <w:rPr>
-          <w:rFonts w:ascii="Consolas" w:cs="Consolas" w:eastAsia="Consolas" w:hAnsi="Consolas"/>
-          <w:sz w:val="16"/>
-          <w:szCs w:val="16"/>
-        </w:rPr>
-        <w:t xml:space="preserve">        plt.title("Importância das variáveis no modelo")</w:t>
-      </w:r>
-    </w:p>
-    <w:p>
-      <w:pPr>
-        <w:shd w:fill="F5F5F5" w:val="clear"/>
-        <w:spacing w:after="0"/>
-      </w:pPr>
-      <w:r>
-        <w:rPr>
-          <w:rFonts w:ascii="Consolas" w:cs="Consolas" w:eastAsia="Consolas" w:hAnsi="Consolas"/>
-          <w:sz w:val="16"/>
-          <w:szCs w:val="16"/>
-        </w:rPr>
-        <w:t xml:space="preserve">        plt.tight_layout()</w:t>
-      </w:r>
-    </w:p>
-    <w:p>
-      <w:pPr>
-        <w:shd w:fill="F5F5F5" w:val="clear"/>
-        <w:spacing w:after="0"/>
-      </w:pPr>
-      <w:r>
-        <w:rPr>
-          <w:rFonts w:ascii="Consolas" w:cs="Consolas" w:eastAsia="Consolas" w:hAnsi="Consolas"/>
-          <w:sz w:val="16"/>
-          <w:szCs w:val="16"/>
-        </w:rPr>
-        <w:t xml:space="preserve">        plt.savefig(os.path.join(GRAF_DIR, "importancia_variaveis.png"), dpi=150)</w:t>
-      </w:r>
-    </w:p>
-    <w:p>
-      <w:pPr>
-        <w:shd w:fill="F5F5F5" w:val="clear"/>
-        <w:spacing w:after="0"/>
-      </w:pPr>
-      <w:r>
-        <w:rPr>
-          <w:rFonts w:ascii="Consolas" w:cs="Consolas" w:eastAsia="Consolas" w:hAnsi="Consolas"/>
-          <w:sz w:val="16"/>
-          <w:szCs w:val="16"/>
-        </w:rPr>
-        <w:t xml:space="preserve">        plt.close()</w:t>
-      </w:r>
-    </w:p>
-    <w:p>
-      <w:pPr>
-        <w:shd w:fill="F5F5F5" w:val="clear"/>
-        <w:spacing w:after="0"/>
-      </w:pPr>
-      <w:r>
-        <w:rPr>
-          <w:rFonts w:ascii="Consolas" w:cs="Consolas" w:eastAsia="Consolas" w:hAnsi="Consolas"/>
-          <w:sz w:val="16"/>
-          <w:szCs w:val="16"/>
-        </w:rPr>
-        <w:t xml:space="preserve"> </w:t>
-      </w:r>
-    </w:p>
-    <w:p>
-      <w:pPr>
-        <w:shd w:fill="F5F5F5" w:val="clear"/>
-        <w:spacing w:after="0"/>
-      </w:pPr>
-      <w:r>
-        <w:rPr>
-          <w:rFonts w:ascii="Consolas" w:cs="Consolas" w:eastAsia="Consolas" w:hAnsi="Consolas"/>
-          <w:sz w:val="16"/>
-          <w:szCs w:val="16"/>
-        </w:rPr>
-        <w:t xml:space="preserve">    # 4) Correlação entre variáveis</w:t>
-      </w:r>
-    </w:p>
-    <w:p>
-      <w:pPr>
-        <w:shd w:fill="F5F5F5" w:val="clear"/>
-        <w:spacing w:after="0"/>
-      </w:pPr>
-      <w:r>
-        <w:rPr>
-          <w:rFonts w:ascii="Consolas" w:cs="Consolas" w:eastAsia="Consolas" w:hAnsi="Consolas"/>
-          <w:sz w:val="16"/>
-          <w:szCs w:val="16"/>
-        </w:rPr>
-        <w:t xml:space="preserve">    plt.figure(figsize=(6, 5))</w:t>
-      </w:r>
-    </w:p>
-    <w:p>
-      <w:pPr>
-        <w:shd w:fill="F5F5F5" w:val="clear"/>
-        <w:spacing w:after="0"/>
-      </w:pPr>
-      <w:r>
-        <w:rPr>
-          <w:rFonts w:ascii="Consolas" w:cs="Consolas" w:eastAsia="Consolas" w:hAnsi="Consolas"/>
-          <w:sz w:val="16"/>
-          <w:szCs w:val="16"/>
-        </w:rPr>
-        <w:t xml:space="preserve">    corr = df[FEATURES + [TARGET]].corr()</w:t>
-      </w:r>
-    </w:p>
-    <w:p>
-      <w:pPr>
-        <w:shd w:fill="F5F5F5" w:val="clear"/>
-        <w:spacing w:after="0"/>
-      </w:pPr>
-      <w:r>
-        <w:rPr>
-          <w:rFonts w:ascii="Consolas" w:cs="Consolas" w:eastAsia="Consolas" w:hAnsi="Consolas"/>
-          <w:sz w:val="16"/>
-          <w:szCs w:val="16"/>
-        </w:rPr>
-        <w:t xml:space="preserve">    im = plt.imshow(corr, cmap="Blues", vmin=-1, vmax=1)</w:t>
-      </w:r>
-    </w:p>
-    <w:p>
-      <w:pPr>
-        <w:shd w:fill="F5F5F5" w:val="clear"/>
-        <w:spacing w:after="0"/>
-      </w:pPr>
-      <w:r>
-        <w:rPr>
-          <w:rFonts w:ascii="Consolas" w:cs="Consolas" w:eastAsia="Consolas" w:hAnsi="Consolas"/>
-          <w:sz w:val="16"/>
-          <w:szCs w:val="16"/>
-        </w:rPr>
-        <w:t xml:space="preserve">    plt.colorbar(im, label="Correlação")</w:t>
-      </w:r>
-    </w:p>
-    <w:p>
-      <w:pPr>
-        <w:shd w:fill="F5F5F5" w:val="clear"/>
-        <w:spacing w:after="0"/>
-      </w:pPr>
-      <w:r>
-        <w:rPr>
-          <w:rFonts w:ascii="Consolas" w:cs="Consolas" w:eastAsia="Consolas" w:hAnsi="Consolas"/>
-          <w:sz w:val="16"/>
-          <w:szCs w:val="16"/>
-        </w:rPr>
-        <w:t xml:space="preserve">    plt.xticks(range(len(corr.columns)), corr.columns, rotation=45, ha="right")</w:t>
-      </w:r>
-    </w:p>
-    <w:p>
-      <w:pPr>
-        <w:shd w:fill="F5F5F5" w:val="clear"/>
-        <w:spacing w:after="0"/>
-      </w:pPr>
-      <w:r>
-        <w:rPr>
-          <w:rFonts w:ascii="Consolas" w:cs="Consolas" w:eastAsia="Consolas" w:hAnsi="Consolas"/>
-          <w:sz w:val="16"/>
-          <w:szCs w:val="16"/>
-        </w:rPr>
-        <w:t xml:space="preserve">    plt.yticks(range(len(corr.columns)), corr.columns)</w:t>
-      </w:r>
-    </w:p>
-    <w:p>
-      <w:pPr>
-        <w:shd w:fill="F5F5F5" w:val="clear"/>
-        <w:spacing w:after="0"/>
-      </w:pPr>
-      <w:r>
-        <w:rPr>
-          <w:rFonts w:ascii="Consolas" w:cs="Consolas" w:eastAsia="Consolas" w:hAnsi="Consolas"/>
-          <w:sz w:val="16"/>
-          <w:szCs w:val="16"/>
-        </w:rPr>
-        <w:t xml:space="preserve">    for i in range(len(corr.columns)):</w:t>
-      </w:r>
-    </w:p>
-    <w:p>
-      <w:pPr>
-        <w:shd w:fill="F5F5F5" w:val="clear"/>
-        <w:spacing w:after="0"/>
-      </w:pPr>
-      <w:r>
-        <w:rPr>
-          <w:rFonts w:ascii="Consolas" w:cs="Consolas" w:eastAsia="Consolas" w:hAnsi="Consolas"/>
-          <w:sz w:val="16"/>
-          <w:szCs w:val="16"/>
-        </w:rPr>
-        <w:t xml:space="preserve">        for j in range(len(corr.columns)):</w:t>
-      </w:r>
-    </w:p>
-    <w:p>
-      <w:pPr>
-        <w:shd w:fill="F5F5F5" w:val="clear"/>
-        <w:spacing w:after="0"/>
-      </w:pPr>
-      <w:r>
-        <w:rPr>
-          <w:rFonts w:ascii="Consolas" w:cs="Consolas" w:eastAsia="Consolas" w:hAnsi="Consolas"/>
-          <w:sz w:val="16"/>
-          <w:szCs w:val="16"/>
-        </w:rPr>
-        <w:t xml:space="preserve">            plt.text(j, i, f"{corr.iloc[i, j]:.2f}", ha="center", va="center", fontsize=8)</w:t>
-      </w:r>
-    </w:p>
-    <w:p>
-      <w:pPr>
-        <w:shd w:fill="F5F5F5" w:val="clear"/>
-        <w:spacing w:after="0"/>
-      </w:pPr>
-      <w:r>
-        <w:rPr>
-          <w:rFonts w:ascii="Consolas" w:cs="Consolas" w:eastAsia="Consolas" w:hAnsi="Consolas"/>
-          <w:sz w:val="16"/>
-          <w:szCs w:val="16"/>
-        </w:rPr>
-        <w:t xml:space="preserve">    plt.title("Matriz de correlação")</w:t>
-      </w:r>
-    </w:p>
-    <w:p>
-      <w:pPr>
-        <w:shd w:fill="F5F5F5" w:val="clear"/>
-        <w:spacing w:after="0"/>
-      </w:pPr>
-      <w:r>
-        <w:rPr>
-          <w:rFonts w:ascii="Consolas" w:cs="Consolas" w:eastAsia="Consolas" w:hAnsi="Consolas"/>
-          <w:sz w:val="16"/>
-          <w:szCs w:val="16"/>
-        </w:rPr>
-        <w:t xml:space="preserve">    plt.tight_layout()</w:t>
-      </w:r>
-    </w:p>
-    <w:p>
-      <w:pPr>
-        <w:shd w:fill="F5F5F5" w:val="clear"/>
-        <w:spacing w:after="0"/>
-      </w:pPr>
-      <w:r>
-        <w:rPr>
-          <w:rFonts w:ascii="Consolas" w:cs="Consolas" w:eastAsia="Consolas" w:hAnsi="Consolas"/>
-          <w:sz w:val="16"/>
-          <w:szCs w:val="16"/>
-        </w:rPr>
-        <w:t xml:space="preserve">    plt.savefig(os.path.join(GRAF_DIR, "matriz_correlacao.png"), dpi=150)</w:t>
-      </w:r>
-    </w:p>
-    <w:p>
-      <w:pPr>
-        <w:shd w:fill="F5F5F5" w:val="clear"/>
-        <w:spacing w:after="0"/>
-      </w:pPr>
-      <w:r>
-        <w:rPr>
-          <w:rFonts w:ascii="Consolas" w:cs="Consolas" w:eastAsia="Consolas" w:hAnsi="Consolas"/>
-          <w:sz w:val="16"/>
-          <w:szCs w:val="16"/>
-        </w:rPr>
-        <w:t xml:space="preserve">    plt.close()</w:t>
-      </w:r>
-    </w:p>
-    <w:p>
-      <w:pPr>
-        <w:shd w:fill="F5F5F5" w:val="clear"/>
-        <w:spacing w:after="0"/>
-      </w:pPr>
-      <w:r>
-        <w:rPr>
-          <w:rFonts w:ascii="Consolas" w:cs="Consolas" w:eastAsia="Consolas" w:hAnsi="Consolas"/>
-          <w:sz w:val="16"/>
-          <w:szCs w:val="16"/>
-        </w:rPr>
-        <w:t xml:space="preserve"> </w:t>
-      </w:r>
-    </w:p>
-    <w:p>
-      <w:pPr>
-        <w:shd w:fill="F5F5F5" w:val="clear"/>
-        <w:spacing w:after="0"/>
-      </w:pPr>
-      <w:r>
-        <w:rPr>
-          <w:rFonts w:ascii="Consolas" w:cs="Consolas" w:eastAsia="Consolas" w:hAnsi="Consolas"/>
-          <w:sz w:val="16"/>
-          <w:szCs w:val="16"/>
-        </w:rPr>
-        <w:t xml:space="preserve">    print(f"\nGráficos salvos em {GRAF_DIR}/")</w:t>
+        <w:t xml:space="preserve">    grafico_real_vs_previsto(np.array(y_test), resultado["y_pred"])</w:t>
+      </w:r>
+    </w:p>
+    <w:p>
+      <w:pPr>
+        <w:shd w:fill="F5F5F5" w:val="clear"/>
+        <w:spacing w:after="0"/>
+      </w:pPr>
+      <w:r>
+        <w:rPr>
+          <w:rFonts w:ascii="Consolas" w:cs="Consolas" w:eastAsia="Consolas" w:hAnsi="Consolas"/>
+          <w:sz w:val="16"/>
+          <w:szCs w:val="16"/>
+        </w:rPr>
+        <w:t xml:space="preserve">    grafico_distribuicao_erros(resultado["erros"], resultado["media_erro"])</w:t>
+      </w:r>
+    </w:p>
+    <w:p>
+      <w:pPr>
+        <w:shd w:fill="F5F5F5" w:val="clear"/>
+        <w:spacing w:after="0"/>
+      </w:pPr>
+      <w:r>
+        <w:rPr>
+          <w:rFonts w:ascii="Consolas" w:cs="Consolas" w:eastAsia="Consolas" w:hAnsi="Consolas"/>
+          <w:sz w:val="16"/>
+          <w:szCs w:val="16"/>
+        </w:rPr>
+        <w:t xml:space="preserve">    grafico_correlacao(df)</w:t>
       </w:r>
     </w:p>
     <w:p>
@@ -3335,7 +3209,7 @@
           <w:sz w:val="16"/>
           <w:szCs w:val="16"/>
         </w:rPr>
-        <w:t xml:space="preserve">    print(f"Resumo salvo em {OUT_DIR}/resumo_resultados.txt")</w:t>
+        <w:t xml:space="preserve">    print(f"\nResumo salvo em {OUT_DIR}/resumo_resultados.txt")</w:t>
       </w:r>
     </w:p>
     <w:p>
@@ -3763,201 +3637,7 @@
         <w:pStyle w:val="Heading1"/>
       </w:pPr>
       <w:r>
-        <w:t xml:space="preserve">5. Gráficos</w:t>
-      </w:r>
-    </w:p>
-    <w:p>
-      <w:pPr>
-        <w:pStyle w:val="Heading2"/>
-      </w:pPr>
-      <w:r>
-        <w:t xml:space="preserve">5.1 Nota real vs. nota prevista</w:t>
-      </w:r>
-    </w:p>
-    <w:p>
-      <w:pPr>
-        <w:spacing w:after="200"/>
-      </w:pPr>
-      <w:r>
-        <w:t xml:space="preserve">A dispersão dos pontos próxima à linha diagonal (previsão perfeita) indica que o modelo acompanha bem a tendência real das notas, com poucos desvios grandes.</w:t>
-      </w:r>
-    </w:p>
-    <w:p>
-      <w:pPr>
-        <w:spacing w:after="200"/>
-        <w:jc w:val="center"/>
-      </w:pPr>
-      <w:r>
-        <w:drawing>
-          <wp:inline distT="0" distB="0" distL="0" distR="0">
-            <wp:extent cx="4000500" cy="4000500"/>
-            <wp:effectExtent t="0" r="0" b="0" l="0"/>
-            <wp:docPr id="1" name="" descr="" title=""/>
-            <wp:cNvGraphicFramePr>
-              <a:graphicFrameLocks xmlns:a="http://schemas.openxmlformats.org/drawingml/2006/main" noChangeAspect="1"/>
-            </wp:cNvGraphicFramePr>
-            <a:graphic xmlns:a="http://schemas.openxmlformats.org/drawingml/2006/main">
-              <a:graphicData uri="http://schemas.openxmlformats.org/drawingml/2006/picture">
-                <pic:pic xmlns:pic="http://schemas.openxmlformats.org/drawingml/2006/picture">
-                  <pic:nvPicPr>
-                    <pic:cNvPr id="0" name="" descr=""/>
-                    <pic:cNvPicPr>
-                      <a:picLocks noChangeAspect="1" noChangeArrowheads="1"/>
-                    </pic:cNvPicPr>
-                  </pic:nvPicPr>
-                  <pic:blipFill>
-                    <a:blip r:embed="rId7" cstate="none"/>
-                    <a:srcRect/>
-                    <a:stretch>
-                      <a:fillRect/>
-                    </a:stretch>
-                  </pic:blipFill>
-                  <pic:spPr bwMode="auto">
-                    <a:xfrm>
-                      <a:off x="0" y="0"/>
-                      <a:ext cx="4000500" cy="4000500"/>
-                    </a:xfrm>
-                    <a:prstGeom prst="rect">
-                      <a:avLst/>
-                    </a:prstGeom>
-                  </pic:spPr>
-                </pic:pic>
-              </a:graphicData>
-            </a:graphic>
-          </wp:inline>
-        </w:drawing>
-      </w:r>
-    </w:p>
-    <w:p>
-      <w:pPr>
-        <w:pStyle w:val="Heading2"/>
-      </w:pPr>
-      <w:r>
-        <w:t xml:space="preserve">5.2 Distribuição dos erros de previsão</w:t>
-      </w:r>
-    </w:p>
-    <w:p>
-      <w:pPr>
-        <w:spacing w:after="200"/>
-      </w:pPr>
-      <w:r>
-        <w:t xml:space="preserve">O histograma mostra que os erros se concentram próximos de zero e seguem um formato aproximadamente normal (em formato de sino), o que valida o uso do intervalo de erro de 95% baseado no desvio padrão.</w:t>
-      </w:r>
-    </w:p>
-    <w:p>
-      <w:pPr>
-        <w:spacing w:after="200"/>
-        <w:jc w:val="center"/>
-      </w:pPr>
-      <w:r>
-        <w:drawing>
-          <wp:inline distT="0" distB="0" distL="0" distR="0">
-            <wp:extent cx="4000500" cy="2667000"/>
-            <wp:effectExtent t="0" r="0" b="0" l="0"/>
-            <wp:docPr id="1" name="" descr="" title=""/>
-            <wp:cNvGraphicFramePr>
-              <a:graphicFrameLocks xmlns:a="http://schemas.openxmlformats.org/drawingml/2006/main" noChangeAspect="1"/>
-            </wp:cNvGraphicFramePr>
-            <a:graphic xmlns:a="http://schemas.openxmlformats.org/drawingml/2006/main">
-              <a:graphicData uri="http://schemas.openxmlformats.org/drawingml/2006/picture">
-                <pic:pic xmlns:pic="http://schemas.openxmlformats.org/drawingml/2006/picture">
-                  <pic:nvPicPr>
-                    <pic:cNvPr id="0" name="" descr=""/>
-                    <pic:cNvPicPr>
-                      <a:picLocks noChangeAspect="1" noChangeArrowheads="1"/>
-                    </pic:cNvPicPr>
-                  </pic:nvPicPr>
-                  <pic:blipFill>
-                    <a:blip r:embed="rId8" cstate="none"/>
-                    <a:srcRect/>
-                    <a:stretch>
-                      <a:fillRect/>
-                    </a:stretch>
-                  </pic:blipFill>
-                  <pic:spPr bwMode="auto">
-                    <a:xfrm>
-                      <a:off x="0" y="0"/>
-                      <a:ext cx="4000500" cy="2667000"/>
-                    </a:xfrm>
-                    <a:prstGeom prst="rect">
-                      <a:avLst/>
-                    </a:prstGeom>
-                  </pic:spPr>
-                </pic:pic>
-              </a:graphicData>
-            </a:graphic>
-          </wp:inline>
-        </w:drawing>
-      </w:r>
-    </w:p>
-    <w:p>
-      <w:pPr>
-        <w:pStyle w:val="Heading2"/>
-      </w:pPr>
-      <w:r>
-        <w:t xml:space="preserve">5.3 Matriz de correlação entre variáveis</w:t>
-      </w:r>
-    </w:p>
-    <w:p>
-      <w:pPr>
-        <w:spacing w:after="200"/>
-      </w:pPr>
-      <w:r>
-        <w:t xml:space="preserve">A matriz de correlação confirma que nota_anterior e horas_estudo são as variáveis mais correlacionadas com a nota_final, seguidas por frequência e atividades entregues — coerente com os pesos usados na geração da base.</w:t>
-      </w:r>
-    </w:p>
-    <w:p>
-      <w:pPr>
-        <w:spacing w:after="200"/>
-        <w:jc w:val="center"/>
-      </w:pPr>
-      <w:r>
-        <w:drawing>
-          <wp:inline distT="0" distB="0" distL="0" distR="0">
-            <wp:extent cx="4000500" cy="3333750"/>
-            <wp:effectExtent t="0" r="0" b="0" l="0"/>
-            <wp:docPr id="1" name="" descr="" title=""/>
-            <wp:cNvGraphicFramePr>
-              <a:graphicFrameLocks xmlns:a="http://schemas.openxmlformats.org/drawingml/2006/main" noChangeAspect="1"/>
-            </wp:cNvGraphicFramePr>
-            <a:graphic xmlns:a="http://schemas.openxmlformats.org/drawingml/2006/main">
-              <a:graphicData uri="http://schemas.openxmlformats.org/drawingml/2006/picture">
-                <pic:pic xmlns:pic="http://schemas.openxmlformats.org/drawingml/2006/picture">
-                  <pic:nvPicPr>
-                    <pic:cNvPr id="0" name="" descr=""/>
-                    <pic:cNvPicPr>
-                      <a:picLocks noChangeAspect="1" noChangeArrowheads="1"/>
-                    </pic:cNvPicPr>
-                  </pic:nvPicPr>
-                  <pic:blipFill>
-                    <a:blip r:embed="rId9" cstate="none"/>
-                    <a:srcRect/>
-                    <a:stretch>
-                      <a:fillRect/>
-                    </a:stretch>
-                  </pic:blipFill>
-                  <pic:spPr bwMode="auto">
-                    <a:xfrm>
-                      <a:off x="0" y="0"/>
-                      <a:ext cx="4000500" cy="3333750"/>
-                    </a:xfrm>
-                    <a:prstGeom prst="rect">
-                      <a:avLst/>
-                    </a:prstGeom>
-                  </pic:spPr>
-                </pic:pic>
-              </a:graphicData>
-            </a:graphic>
-          </wp:inline>
-        </w:drawing>
-      </w:r>
-    </w:p>
-    <w:p>
-      <w:pPr>
-        <w:pStyle w:val="Heading1"/>
-      </w:pPr>
-      <w:r>
-        <w:t xml:space="preserve">6. Interpretação e avaliação do modelo</w:t>
+        <w:t xml:space="preserve">5. Interpretação e avaliação do modelo</w:t>
       </w:r>
     </w:p>
     <w:p>
@@ -4009,7 +3689,7 @@
         <w:pStyle w:val="Heading1"/>
       </w:pPr>
       <w:r>
-        <w:t xml:space="preserve">7. Como reproduzir</w:t>
+        <w:t xml:space="preserve">6. Como reproduzir</w:t>
       </w:r>
     </w:p>
     <w:p>
@@ -4048,7 +3728,7 @@
         <w:spacing w:after="100"/>
       </w:pPr>
       <w:r>
-        <w:t xml:space="preserve">Treinar o modelo e gerar métricas/gráficos: python src/treinar_modelo.py</w:t>
+        <w:t xml:space="preserve">Treinar o modelo, ver métricas e gráficos no terminal: python src/treinar_modelo.py</w:t>
       </w:r>
     </w:p>
     <w:p>

</xml_diff>